<commit_message>
Clean and Good UI
</commit_message>
<xml_diff>
--- a/IEEE electricty paper - 7 pages.docx
+++ b/IEEE electricty paper - 7 pages.docx
@@ -291,15 +291,6 @@
       </w:r>
     </w:p>
     <w:p>
-      <w:pPr>
-        <w:sectPr>
-          <w:type w:val="continuous"/>
-          <w:pgSz w:w="11906" w:h="16838" w:code="9"/>
-          <w:pgMar w:top="450" w:right="893" w:bottom="1440" w:left="893" w:header="720" w:footer="720" w:gutter="0"/>
-          <w:cols w:num="3" w:space="720"/>
-          <w:docGrid w:linePitch="360"/>
-        </w:sectPr>
-      </w:pPr>
       <w:r>
         <w:rPr>
           <w:noProof/>
@@ -351,18 +342,9 @@
           <w:t>tamilhackerd@gmail.com</w:t>
         </w:r>
       </w:hyperlink>
-      <w:r>
-        <w:rPr>
-          <w:noProof/>
-          <w:sz w:val="18"/>
-          <w:szCs w:val="18"/>
-        </w:rPr>
-        <w:br/>
-      </w:r>
-    </w:p>
-    <w:p>
-      <w:pPr>
-        <w:jc w:val="both"/>
+    </w:p>
+    <w:p>
+      <w:pPr>
         <w:sectPr>
           <w:type w:val="continuous"/>
           <w:pgSz w:w="11906" w:h="16838" w:code="9"/>
@@ -371,6 +353,14 @@
           <w:docGrid w:linePitch="360"/>
         </w:sectPr>
       </w:pPr>
+      <w:r>
+        <w:rPr>
+          <w:noProof/>
+          <w:sz w:val="18"/>
+          <w:szCs w:val="18"/>
+        </w:rPr>
+        <w:br/>
+      </w:r>
     </w:p>
     <w:p>
       <w:pPr>
@@ -668,16 +658,14 @@
     </w:p>
     <w:p>
       <w:pPr>
-        <w:pStyle w:val="Abstract"/>
-        <w:ind w:firstLine="0"/>
-      </w:pPr>
-    </w:p>
-    <w:p>
-      <w:pPr>
         <w:pStyle w:val="Heading1"/>
-      </w:pPr>
-      <w:r>
-        <w:t xml:space="preserve">Introduction </w:t>
+        <w:numPr>
+          <w:ilvl w:val="0"/>
+          <w:numId w:val="29"/>
+        </w:numPr>
+      </w:pPr>
+      <w:r>
+        <w:t>Introduction</w:t>
       </w:r>
     </w:p>
     <w:p>
@@ -685,13 +673,13 @@
         <w:pStyle w:val="selectable-text"/>
         <w:jc w:val="both"/>
         <w:rPr>
-          <w:lang w:val="en-US"/>
-        </w:rPr>
-      </w:pPr>
-      <w:r>
-        <w:rPr>
           <w:rStyle w:val="selectable-text1"/>
         </w:rPr>
+      </w:pPr>
+      <w:r>
+        <w:rPr>
+          <w:rStyle w:val="selectable-text1"/>
+        </w:rPr>
         <w:t xml:space="preserve">Electricity is one of the most important things in our </w:t>
       </w:r>
       <w:proofErr w:type="gramStart"/>
@@ -706,258 +694,296 @@
         <w:rPr>
           <w:rStyle w:val="selectable-text1"/>
         </w:rPr>
-        <w:t xml:space="preserve"> life for industrial developments, our houses and modern life. Nowadays the demand of electricity is increasing due to the increasing number of electric vehicles, increasing digital infrastructure etc. in the world. It will help to lower the </w:t>
-      </w:r>
-      <w:proofErr w:type="spellStart"/>
+        <w:t xml:space="preserve"> life for industrial developments, </w:t>
+      </w:r>
+      <w:proofErr w:type="gramStart"/>
       <w:r>
         <w:rPr>
           <w:rStyle w:val="selectable-text1"/>
         </w:rPr>
-        <w:t>green house</w:t>
-      </w:r>
-      <w:proofErr w:type="spellEnd"/>
+        <w:t>our</w:t>
+      </w:r>
+      <w:proofErr w:type="gramEnd"/>
       <w:r>
         <w:rPr>
           <w:rStyle w:val="selectable-text1"/>
         </w:rPr>
-        <w:t xml:space="preserve"> gas emissions whenever the electricity demand also rises in the same time when renewable energy sources like solar</w:t>
-      </w:r>
-      <w:r>
-        <w:rPr>
-          <w:rStyle w:val="selectable-text1"/>
-        </w:rPr>
-        <w:t xml:space="preserve"> or </w:t>
-      </w:r>
-      <w:r>
-        <w:rPr>
-          <w:rStyle w:val="selectable-text1"/>
-        </w:rPr>
-        <w:t xml:space="preserve">wind are being fast integrated into the power systems to access carbon neutrality. The renewable energy generation's environmental benefits are very weather-dependent. The changes have made the operation of the power system more difficult, balancing of the grid, long-term energy planning. We need to make the forecasting accurate the electricity demand and supply will ensure it have </w:t>
-      </w:r>
-      <w:proofErr w:type="gramStart"/>
-      <w:r>
-        <w:rPr>
-          <w:rStyle w:val="selectable-text1"/>
-        </w:rPr>
-        <w:t>stable  grid</w:t>
-      </w:r>
-      <w:proofErr w:type="gramEnd"/>
-      <w:r>
-        <w:rPr>
-          <w:rStyle w:val="selectable-text1"/>
-        </w:rPr>
-        <w:t xml:space="preserve"> operation. Over the years, the electricity demand forecasting has been enhanced from the old traditional statistical and autoregressive approach to the newer machine learning </w:t>
-      </w:r>
-      <w:r>
-        <w:rPr>
-          <w:rStyle w:val="selectable-text1"/>
-        </w:rPr>
-        <w:t xml:space="preserve">model </w:t>
-      </w:r>
-      <w:r>
-        <w:rPr>
-          <w:rStyle w:val="selectable-text1"/>
-        </w:rPr>
-        <w:t xml:space="preserve">and deep learning </w:t>
-      </w:r>
-      <w:r>
-        <w:rPr>
-          <w:rStyle w:val="selectable-text1"/>
-        </w:rPr>
-        <w:t xml:space="preserve">model </w:t>
-      </w:r>
-      <w:r>
-        <w:rPr>
-          <w:rStyle w:val="selectable-text1"/>
-        </w:rPr>
-        <w:t>approaches.</w:t>
-      </w:r>
-      <w:r>
-        <w:rPr>
-          <w:rStyle w:val="selectable-text1"/>
-        </w:rPr>
-        <w:t xml:space="preserve"> Energy </w:t>
-      </w:r>
-      <w:proofErr w:type="spellStart"/>
-      <w:r>
-        <w:rPr>
-          <w:rStyle w:val="selectable-text1"/>
-        </w:rPr>
-        <w:t>suppy</w:t>
-      </w:r>
-      <w:proofErr w:type="spellEnd"/>
-      <w:r>
-        <w:rPr>
-          <w:rStyle w:val="selectable-text1"/>
-        </w:rPr>
-        <w:t xml:space="preserve"> integration and changing </w:t>
-      </w:r>
-      <w:proofErr w:type="gramStart"/>
-      <w:r>
-        <w:rPr>
-          <w:rStyle w:val="selectable-text1"/>
-        </w:rPr>
-        <w:t>electricity[</w:t>
-      </w:r>
-      <w:proofErr w:type="gramEnd"/>
-      <w:r>
-        <w:rPr>
-          <w:rStyle w:val="selectable-text1"/>
-        </w:rPr>
-        <w:t xml:space="preserve">1] are added to the changed relationships. Further, some meteorological elements like temperature, humidity and seasonality are identified as significant factors of electricity demand. Some studies have demonstrated that assimilation of the weather information can improve the weather forecast in extreme weather and when electricity demand is </w:t>
-      </w:r>
-      <w:proofErr w:type="gramStart"/>
-      <w:r>
-        <w:rPr>
-          <w:rStyle w:val="selectable-text1"/>
-        </w:rPr>
-        <w:t>high[</w:t>
-      </w:r>
-      <w:proofErr w:type="gramEnd"/>
-      <w:r>
-        <w:rPr>
-          <w:rStyle w:val="selectable-text1"/>
-        </w:rPr>
-        <w:t>1</w:t>
-      </w:r>
-      <w:r>
-        <w:rPr>
-          <w:rStyle w:val="selectable-text1"/>
-        </w:rPr>
-        <w:t>], [</w:t>
-      </w:r>
-      <w:r>
-        <w:rPr>
-          <w:rStyle w:val="selectable-text1"/>
-        </w:rPr>
-        <w:t>6].</w:t>
-      </w:r>
-      <w:r>
-        <w:rPr>
-          <w:rStyle w:val="selectable-text1"/>
-        </w:rPr>
         <w:t xml:space="preserve"> </w:t>
-      </w:r>
-      <w:r>
-        <w:rPr>
-          <w:lang w:val="en-US"/>
-        </w:rPr>
-        <w:t xml:space="preserve">Forecasting renewable supply is also critical as the volume of solar and wind generation relies on weather conditions and only occurs when resources are available. Forecasts can support operators to lower </w:t>
-      </w:r>
-      <w:proofErr w:type="spellStart"/>
-      <w:r>
-        <w:rPr>
-          <w:lang w:val="en-US"/>
-        </w:rPr>
-        <w:t>unutilised</w:t>
-      </w:r>
-      <w:proofErr w:type="spellEnd"/>
-      <w:r>
-        <w:rPr>
-          <w:lang w:val="en-US"/>
-        </w:rPr>
-        <w:t xml:space="preserve"> energy, facilitate energy storage planning and store </w:t>
-      </w:r>
-      <w:r>
-        <w:rPr>
-          <w:lang w:val="en-US"/>
-        </w:rPr>
-        <w:lastRenderedPageBreak/>
-        <w:t xml:space="preserve">grid stability [2]. </w:t>
-      </w:r>
-      <w:r>
-        <w:rPr>
-          <w:lang w:val="en-US"/>
-        </w:rPr>
-        <w:t>Most machine learning and deep learning models are deterministic, which means that they do not provide a measure of uncertainty and have improved the accuracy of forecasting. This is addressed by probabilistic forecasting, which generates prediction intervals [3] to capture uncertainty, and recent Transformer-based probabilistic models and Monte Carlo Dropout techniques [3]</w:t>
-      </w:r>
-      <w:proofErr w:type="gramStart"/>
-      <w:r>
-        <w:rPr>
-          <w:lang w:val="en-US"/>
-        </w:rPr>
-        <w:t>–[</w:t>
-      </w:r>
-      <w:proofErr w:type="gramEnd"/>
-      <w:r>
-        <w:rPr>
-          <w:lang w:val="en-US"/>
-        </w:rPr>
-        <w:t>5] which add confidence scores for reflecting real-world uncertainty. Despite this, prior research is disjointed with some focusing on demand forecasting or others on supply forecasting, and probabilistic forecasting has been done independently from combined demand–supply modeling [1]</w:t>
-      </w:r>
-      <w:proofErr w:type="gramStart"/>
-      <w:r>
-        <w:rPr>
-          <w:lang w:val="en-US"/>
-        </w:rPr>
-        <w:t>–[</w:t>
-      </w:r>
-      <w:proofErr w:type="gramEnd"/>
-      <w:r>
-        <w:rPr>
-          <w:lang w:val="en-US"/>
-        </w:rPr>
-        <w:t>2], [3]</w:t>
-      </w:r>
-      <w:proofErr w:type="gramStart"/>
-      <w:r>
-        <w:rPr>
-          <w:lang w:val="en-US"/>
-        </w:rPr>
-        <w:t>–[</w:t>
-      </w:r>
-      <w:proofErr w:type="gramEnd"/>
-      <w:r>
-        <w:rPr>
-          <w:lang w:val="en-US"/>
-        </w:rPr>
-        <w:t xml:space="preserve">5]. There </w:t>
-      </w:r>
-      <w:proofErr w:type="gramStart"/>
-      <w:r>
-        <w:rPr>
-          <w:lang w:val="en-US"/>
-        </w:rPr>
-        <w:t>are</w:t>
-      </w:r>
-      <w:proofErr w:type="gramEnd"/>
-      <w:r>
-        <w:rPr>
-          <w:lang w:val="en-US"/>
-        </w:rPr>
-        <w:t xml:space="preserve"> long-term demand–supply studies, but these are mostly based on scenario analysis, and do not provide uncertainty estimation through machine learning. RAG has also been employed to enhance the factual consistency of power-system question answering using LLMs [8]</w:t>
-      </w:r>
-      <w:proofErr w:type="gramStart"/>
-      <w:r>
-        <w:rPr>
-          <w:lang w:val="en-US"/>
-        </w:rPr>
-        <w:t>–[</w:t>
-      </w:r>
-      <w:proofErr w:type="gramEnd"/>
-      <w:r>
-        <w:rPr>
-          <w:lang w:val="en-US"/>
-        </w:rPr>
-        <w:t>10], but with the exclusion of the actual forecast output in planning.</w:t>
-      </w:r>
-      <w:r>
-        <w:rPr>
-          <w:lang w:val="en-US"/>
-        </w:rPr>
-        <w:t xml:space="preserve"> </w:t>
-      </w:r>
-      <w:r>
-        <w:rPr>
-          <w:lang w:val="en-US"/>
-        </w:rPr>
-        <w:t>To date, there is no common system for forecasting demand and supply, measuring uncertainty and facilitating intelligent energy planning. In this regard, this work attempts to contribute to this field with a Confidence-Driven Probabilistic Machine Learning Framework for Electricity Demand–Supply Gap Forecasting and RAG-Based Energy Planning. The framework relies on historical electricity and weather data to predict demands and supplies, calculate the demand and supply mismatch and provide measures of uncertainty in the form of confidence intervals with varying levels. All of these forecasts are then used together with trusted energy-domain knowledge in a RAG module to produce reliable, explainable planning recommendations, providing a more holistic approach to power-system planning and operation.</w:t>
       </w:r>
     </w:p>
     <w:p>
       <w:pPr>
         <w:pStyle w:val="selectable-text"/>
         <w:jc w:val="both"/>
+        <w:rPr>
+          <w:rStyle w:val="selectable-text1"/>
+        </w:rPr>
+      </w:pPr>
+    </w:p>
+    <w:p>
+      <w:pPr>
+        <w:pStyle w:val="selectable-text"/>
+        <w:jc w:val="both"/>
+        <w:rPr>
+          <w:lang w:val="en-US"/>
+        </w:rPr>
+      </w:pPr>
+      <w:r>
+        <w:rPr>
+          <w:rStyle w:val="selectable-text1"/>
+        </w:rPr>
+        <w:t xml:space="preserve">houses and modern life. Nowadays the demand of electricity is increasing due to the increasing number of electric vehicles, increasing digital infrastructure etc. in the world. It will help to lower the </w:t>
+      </w:r>
+      <w:proofErr w:type="spellStart"/>
+      <w:r>
+        <w:rPr>
+          <w:rStyle w:val="selectable-text1"/>
+        </w:rPr>
+        <w:t>green house</w:t>
+      </w:r>
+      <w:proofErr w:type="spellEnd"/>
+      <w:r>
+        <w:rPr>
+          <w:rStyle w:val="selectable-text1"/>
+        </w:rPr>
+        <w:t xml:space="preserve"> gas emissions whenever the electricity demand also rises in the same time when renewable energy sources like solar</w:t>
+      </w:r>
+      <w:r>
+        <w:rPr>
+          <w:rStyle w:val="selectable-text1"/>
+        </w:rPr>
+        <w:t xml:space="preserve"> or </w:t>
+      </w:r>
+      <w:r>
+        <w:rPr>
+          <w:rStyle w:val="selectable-text1"/>
+        </w:rPr>
+        <w:t xml:space="preserve">wind are being fast integrated into the power systems to access carbon neutrality. The renewable energy generation's environmental benefits are very weather-dependent. The changes have made the operation of the power system more difficult, balancing of the grid, long-term energy planning. We need to make the forecasting accurate the electricity demand and supply will ensure it have </w:t>
+      </w:r>
+      <w:proofErr w:type="gramStart"/>
+      <w:r>
+        <w:rPr>
+          <w:rStyle w:val="selectable-text1"/>
+        </w:rPr>
+        <w:t>stable  grid</w:t>
+      </w:r>
+      <w:proofErr w:type="gramEnd"/>
+      <w:r>
+        <w:rPr>
+          <w:rStyle w:val="selectable-text1"/>
+        </w:rPr>
+        <w:t xml:space="preserve"> operation. Over the years, the electricity demand forecasting has been enhanced from the old traditional statistical and autoregressive approach to the newer machine learning </w:t>
+      </w:r>
+      <w:r>
+        <w:rPr>
+          <w:rStyle w:val="selectable-text1"/>
+        </w:rPr>
+        <w:t xml:space="preserve">model </w:t>
+      </w:r>
+      <w:r>
+        <w:rPr>
+          <w:rStyle w:val="selectable-text1"/>
+        </w:rPr>
+        <w:t xml:space="preserve">and deep learning </w:t>
+      </w:r>
+      <w:r>
+        <w:rPr>
+          <w:rStyle w:val="selectable-text1"/>
+        </w:rPr>
+        <w:t xml:space="preserve">model </w:t>
+      </w:r>
+      <w:r>
+        <w:rPr>
+          <w:rStyle w:val="selectable-text1"/>
+        </w:rPr>
+        <w:t>approaches.</w:t>
+      </w:r>
+      <w:r>
+        <w:rPr>
+          <w:rStyle w:val="selectable-text1"/>
+        </w:rPr>
+        <w:t xml:space="preserve"> Energy </w:t>
+      </w:r>
+      <w:proofErr w:type="spellStart"/>
+      <w:r>
+        <w:rPr>
+          <w:rStyle w:val="selectable-text1"/>
+        </w:rPr>
+        <w:t>suppy</w:t>
+      </w:r>
+      <w:proofErr w:type="spellEnd"/>
+      <w:r>
+        <w:rPr>
+          <w:rStyle w:val="selectable-text1"/>
+        </w:rPr>
+        <w:t xml:space="preserve"> integration and changing </w:t>
+      </w:r>
+      <w:proofErr w:type="gramStart"/>
+      <w:r>
+        <w:rPr>
+          <w:rStyle w:val="selectable-text1"/>
+        </w:rPr>
+        <w:t>electricity[</w:t>
+      </w:r>
+      <w:proofErr w:type="gramEnd"/>
+      <w:r>
+        <w:rPr>
+          <w:rStyle w:val="selectable-text1"/>
+        </w:rPr>
+        <w:t xml:space="preserve">1] are added to the changed relationships. Further, some meteorological elements like temperature, humidity and seasonality are identified as significant factors of electricity demand. Some studies have demonstrated that assimilation of the weather information can improve the weather forecast in extreme weather and when electricity demand is </w:t>
+      </w:r>
+      <w:proofErr w:type="gramStart"/>
+      <w:r>
+        <w:rPr>
+          <w:rStyle w:val="selectable-text1"/>
+        </w:rPr>
+        <w:t>high[</w:t>
+      </w:r>
+      <w:proofErr w:type="gramEnd"/>
+      <w:r>
+        <w:rPr>
+          <w:rStyle w:val="selectable-text1"/>
+        </w:rPr>
+        <w:t>1</w:t>
+      </w:r>
+      <w:r>
+        <w:rPr>
+          <w:rStyle w:val="selectable-text1"/>
+        </w:rPr>
+        <w:t>], [</w:t>
+      </w:r>
+      <w:r>
+        <w:rPr>
+          <w:rStyle w:val="selectable-text1"/>
+        </w:rPr>
+        <w:t>6].</w:t>
+      </w:r>
+      <w:r>
+        <w:rPr>
+          <w:rStyle w:val="selectable-text1"/>
+        </w:rPr>
+        <w:t xml:space="preserve"> </w:t>
+      </w:r>
+      <w:r>
+        <w:rPr>
+          <w:lang w:val="en-US"/>
+        </w:rPr>
+        <w:t xml:space="preserve">Forecasting renewable supply is also critical as the volume of solar and wind generation relies on weather conditions and only occurs when resources are available. Forecasts can support operators to lower </w:t>
+      </w:r>
+      <w:proofErr w:type="spellStart"/>
+      <w:r>
+        <w:rPr>
+          <w:lang w:val="en-US"/>
+        </w:rPr>
+        <w:t>unutilised</w:t>
+      </w:r>
+      <w:proofErr w:type="spellEnd"/>
+      <w:r>
+        <w:rPr>
+          <w:lang w:val="en-US"/>
+        </w:rPr>
+        <w:t xml:space="preserve"> energy, facilitate energy storage planning and store grid stability [2]. </w:t>
+      </w:r>
+      <w:r>
+        <w:rPr>
+          <w:lang w:val="en-US"/>
+        </w:rPr>
+        <w:t xml:space="preserve">Most machine learning and deep learning models are deterministic, which means that they do not provide a measure of uncertainty </w:t>
+      </w:r>
+      <w:r>
+        <w:rPr>
+          <w:lang w:val="en-US"/>
+        </w:rPr>
+        <w:lastRenderedPageBreak/>
+        <w:t>and have improved the accuracy of forecasting. This is addressed by probabilistic forecasting, which generates prediction intervals [3] to capture uncertainty, and recent Transformer-based probabilistic models and Monte Carlo Dropout techniques [3]</w:t>
+      </w:r>
+      <w:proofErr w:type="gramStart"/>
+      <w:r>
+        <w:rPr>
+          <w:lang w:val="en-US"/>
+        </w:rPr>
+        <w:t>–[</w:t>
+      </w:r>
+      <w:proofErr w:type="gramEnd"/>
+      <w:r>
+        <w:rPr>
+          <w:lang w:val="en-US"/>
+        </w:rPr>
+        <w:t>5] which add confidence scores for reflecting real-world uncertainty. Despite this, prior research is disjointed with some focusing on demand forecasting or others on supply forecasting, and probabilistic forecasting has been done independently from combined demand–supply modeling [1]</w:t>
+      </w:r>
+      <w:proofErr w:type="gramStart"/>
+      <w:r>
+        <w:rPr>
+          <w:lang w:val="en-US"/>
+        </w:rPr>
+        <w:t>–[</w:t>
+      </w:r>
+      <w:proofErr w:type="gramEnd"/>
+      <w:r>
+        <w:rPr>
+          <w:lang w:val="en-US"/>
+        </w:rPr>
+        <w:t>2], [3]</w:t>
+      </w:r>
+      <w:proofErr w:type="gramStart"/>
+      <w:r>
+        <w:rPr>
+          <w:lang w:val="en-US"/>
+        </w:rPr>
+        <w:t>–[</w:t>
+      </w:r>
+      <w:proofErr w:type="gramEnd"/>
+      <w:r>
+        <w:rPr>
+          <w:lang w:val="en-US"/>
+        </w:rPr>
+        <w:t xml:space="preserve">5]. There </w:t>
+      </w:r>
+      <w:proofErr w:type="gramStart"/>
+      <w:r>
+        <w:rPr>
+          <w:lang w:val="en-US"/>
+        </w:rPr>
+        <w:t>are</w:t>
+      </w:r>
+      <w:proofErr w:type="gramEnd"/>
+      <w:r>
+        <w:rPr>
+          <w:lang w:val="en-US"/>
+        </w:rPr>
+        <w:t xml:space="preserve"> long-term demand–supply studies, but these are mostly based on scenario analysis, and do not provide uncertainty estimation through machine learning. RAG has also been employed to enhance the factual consistency of power-system question answering using LLMs [8]</w:t>
+      </w:r>
+      <w:proofErr w:type="gramStart"/>
+      <w:r>
+        <w:rPr>
+          <w:lang w:val="en-US"/>
+        </w:rPr>
+        <w:t>–[</w:t>
+      </w:r>
+      <w:proofErr w:type="gramEnd"/>
+      <w:r>
+        <w:rPr>
+          <w:lang w:val="en-US"/>
+        </w:rPr>
+        <w:t>10], but with the exclusion of the actual forecast output in planning.</w:t>
+      </w:r>
+      <w:r>
+        <w:rPr>
+          <w:lang w:val="en-US"/>
+        </w:rPr>
+        <w:t xml:space="preserve"> </w:t>
+      </w:r>
+      <w:r>
+        <w:rPr>
+          <w:lang w:val="en-US"/>
+        </w:rPr>
+        <w:t>To date, there is no common system for forecasting demand and supply, measuring uncertainty and facilitating intelligent energy planning. In this regard, this work attempts to contribute to this field with a Confidence-Driven Probabilistic Machine Learning Framework for Electricity Demand–Supply Gap Forecasting and RAG-Based Energy Planning. The framework relies on historical electricity and weather data to predict demands and supplies, calculate the demand and supply mismatch and provide measures of uncertainty in the form of confidence intervals with varying levels. All of these forecasts are then used together with trusted energy-domain knowledge in a RAG module to produce reliable, explainable planning recommendations, providing a more holistic approach to power-system planning and operation.</w:t>
+      </w:r>
+    </w:p>
+    <w:p>
+      <w:pPr>
+        <w:pStyle w:val="selectable-text"/>
+        <w:jc w:val="both"/>
       </w:pPr>
       <w:r>
         <w:tab/>
@@ -1018,13 +1044,7 @@
         <w:rPr>
           <w:lang w:val="en-US"/>
         </w:rPr>
-        <w:t xml:space="preserve">Demand forecasting plays a crucial role in generation scheduling and balancing supply and demand. With the increasing complexity of the grid, early techniques such as ARIMA, regression and support vector machines were too simple to describe the nonlinearity and volatility of the actual demand data, reducing their accuracy [7] [8]. In this, deep learning was used to decompose the </w:t>
-      </w:r>
-      <w:r>
-        <w:rPr>
-          <w:lang w:val="en-US"/>
-        </w:rPr>
-        <w:t>demand signals into trend and noise parts, similar to the ECEEMDAN-</w:t>
+        <w:t>Demand forecasting plays a crucial role in generation scheduling and balancing supply and demand. With the increasing complexity of the grid, early techniques such as ARIMA, regression and support vector machines were too simple to describe the nonlinearity and volatility of the actual demand data, reducing their accuracy [7] [8]. In this, deep learning was used to decompose the demand signals into trend and noise parts, similar to the ECEEMDAN-</w:t>
       </w:r>
       <w:proofErr w:type="spellStart"/>
       <w:r>
@@ -1038,7 +1058,13 @@
         <w:rPr>
           <w:lang w:val="en-US"/>
         </w:rPr>
-        <w:t xml:space="preserve"> model [9]. The long-horizon accuracy was further improved in transformer-based methods, including TPEDF [10] and PMS-EDF [11] which also estimated uncertainty. Furthermore, integrating weather data such as weather and rainfall into LSTM and Transformer models has also enhanced their accuracy under sudden demand changes [12] and [13]. However, research on demand forecasting continues to be independent of supply forecasting and there is no way to estimate the difference between these and/or offer confidence intervals for planning purposes.</w:t>
+        <w:t xml:space="preserve"> model [9]. The long-horizon accuracy was further improved in </w:t>
+      </w:r>
+      <w:r>
+        <w:rPr>
+          <w:lang w:val="en-US"/>
+        </w:rPr>
+        <w:t>transformer-based methods, including TPEDF [10] and PMS-EDF [11] which also estimated uncertainty. Furthermore, integrating weather data such as weather and rainfall into LSTM and Transformer models has also enhanced their accuracy under sudden demand changes [12] and [13]. However, research on demand forecasting continues to be independent of supply forecasting and there is no way to estimate the difference between these and/or offer confidence intervals for planning purposes.</w:t>
       </w:r>
     </w:p>
     <w:p>
@@ -1118,14 +1144,14 @@
         <w:rPr>
           <w:lang w:val="en-US"/>
         </w:rPr>
-        <w:t xml:space="preserve">In addition, the use of probabilistic forecasting, that is, the generation of a range of forecast outcomes with confidence intervals, has received attention [20],[21] as a way of providing greater insight into forecasting reliability than a single point forecast. This is used in demand forecasting in TPEDF [20] and PMS-EDF [21] and similar techniques are used to enhance the scheduling and reserve allocation of the supply side [22, 23]. A prominent research work uses a joint probability distribution to forecast demand and supply side together and improves over deterministic approaches [24]. </w:t>
+        <w:t xml:space="preserve">In addition, the use of probabilistic forecasting, that is, the generation of a range of forecast outcomes with confidence intervals, has received attention [20],[21] as a way of providing greater insight into forecasting reliability than a single point forecast. This is used in demand forecasting in TPEDF [20] and PMS-EDF [21] and similar techniques are used to enhance the scheduling and reserve allocation of the supply side [22, 23]. A prominent research work uses a joint probability distribution to forecast demand and supply side together and improves over deterministic approaches [24]. Uncertainty can be quantified with broader methods such as quantile regression [25] and Bayesian methods [26] or Monte Carlo sampling. </w:t>
       </w:r>
       <w:r>
         <w:rPr>
           <w:lang w:val="en-US"/>
         </w:rPr>
         <w:lastRenderedPageBreak/>
-        <w:t>Uncertainty can be quantified with broader methods such as quantile regression [25] and Bayesian methods [26] or Monte Carlo sampling. Despite that, most work handles address the estimation of the demand–supply gap individually, the estimation of this gap together with confidence intervals is little explored, and none of this is related to decision-support systems.</w:t>
+        <w:t>Despite that, most work handles address the estimation of the demand–supply gap individually, the estimation of this gap together with confidence intervals is little explored, and none of this is related to decision-support systems.</w:t>
       </w:r>
     </w:p>
     <w:p>
@@ -1195,14 +1221,26 @@
     <w:p>
       <w:pPr>
         <w:pStyle w:val="selectable-text"/>
-        <w:jc w:val="both"/>
-      </w:pPr>
+        <w:jc w:val="center"/>
+      </w:pPr>
+      <w:r>
+        <w:t>I</w:t>
+      </w:r>
+      <w:r>
+        <w:t>II</w:t>
+      </w:r>
+      <w:r>
+        <w:t xml:space="preserve"> Methodology</w:t>
+      </w:r>
     </w:p>
     <w:p>
       <w:pPr>
         <w:pStyle w:val="selectable-text"/>
         <w:jc w:val="both"/>
       </w:pPr>
+      <w:r>
+        <w:t>3.1 Data Collection</w:t>
+      </w:r>
     </w:p>
     <w:p>
       <w:pPr>
@@ -1210,51 +1248,6 @@
         <w:jc w:val="both"/>
       </w:pPr>
       <w:r>
-        <w:t xml:space="preserve">      </w:t>
-      </w:r>
-    </w:p>
-    <w:p>
-      <w:pPr>
-        <w:pStyle w:val="selectable-text"/>
-        <w:jc w:val="both"/>
-        <w:rPr>
-          <w:lang w:val="en-US"/>
-        </w:rPr>
-      </w:pPr>
-      <w:r>
-        <w:t xml:space="preserve"> </w:t>
-      </w:r>
-      <w:r>
-        <w:tab/>
-      </w:r>
-      <w:r>
-        <w:tab/>
-      </w:r>
-      <w:r>
-        <w:t>I</w:t>
-      </w:r>
-      <w:r>
-        <w:t>II</w:t>
-      </w:r>
-      <w:r>
-        <w:t xml:space="preserve"> Methodology</w:t>
-      </w:r>
-    </w:p>
-    <w:p>
-      <w:pPr>
-        <w:pStyle w:val="selectable-text"/>
-        <w:jc w:val="both"/>
-      </w:pPr>
-      <w:r>
-        <w:t>3.1 Data Collection</w:t>
-      </w:r>
-    </w:p>
-    <w:p>
-      <w:pPr>
-        <w:pStyle w:val="selectable-text"/>
-        <w:jc w:val="both"/>
-      </w:pPr>
-      <w:r>
         <w:t xml:space="preserve">The datasets were collected from government and public sources, including </w:t>
       </w:r>
       <w:r>
@@ -1267,7 +1260,13 @@
         <w:rPr>
           <w:lang w:val="en-US"/>
         </w:rPr>
-        <w:t>The data was reviewed, aligned, and integrated for demand and supply forecasting, gap analysis, and RAG-based energy planning.</w:t>
+        <w:t xml:space="preserve">The data was reviewed, aligned, and integrated for </w:t>
+      </w:r>
+      <w:r>
+        <w:rPr>
+          <w:lang w:val="en-US"/>
+        </w:rPr>
+        <w:t>demand and supply forecasting, gap analysis, and RAG-based energy planning.</w:t>
       </w:r>
     </w:p>
     <w:tbl>
@@ -1687,43 +1686,49 @@
         <w:rPr>
           <w:lang w:val="en-US"/>
         </w:rPr>
-        <w:t xml:space="preserve"> developed for electricity demand forecasting. The models used weather variables, calendar features, festival information, and historical demand patterns as input features. Historical demand was represented using 1-, 2-, and 3-month lag values and 3-, 6-, and 12-month rolling averages, while Month was represented using sine and cosine transformations </w:t>
+        <w:t xml:space="preserve"> developed for electricity demand forecasting. The models used weather variables, calendar features, festival information, and historical demand patterns as input features. Historical demand was represented using 1-, 2-, and 3-month lag values and 3-, 6-, and 12-month rolling averages, while Month was represented using sine and cosine transformations to capture seasonal patterns. The models were trained using a chronological split, with the last 24 months reserved for testing. Performance was evaluated using MAE, RMSE, MAPE, and R². The models achieved R² scores of 0.31, 0.34, 0.29, and 0.78 for Random Forest, </w:t>
+      </w:r>
+      <w:proofErr w:type="spellStart"/>
+      <w:r>
+        <w:rPr>
+          <w:lang w:val="en-US"/>
+        </w:rPr>
+        <w:t>XGBoost</w:t>
+      </w:r>
+      <w:proofErr w:type="spellEnd"/>
+      <w:r>
+        <w:rPr>
+          <w:lang w:val="en-US"/>
+        </w:rPr>
+        <w:t xml:space="preserve">, </w:t>
+      </w:r>
+      <w:proofErr w:type="spellStart"/>
+      <w:r>
+        <w:rPr>
+          <w:lang w:val="en-US"/>
+        </w:rPr>
+        <w:t>LightGBM</w:t>
+      </w:r>
+      <w:proofErr w:type="spellEnd"/>
+      <w:r>
+        <w:rPr>
+          <w:lang w:val="en-US"/>
+        </w:rPr>
+        <w:t xml:space="preserve">, and LSTM, respectively. LSTM achieved the best </w:t>
       </w:r>
       <w:r>
         <w:rPr>
           <w:lang w:val="en-US"/>
         </w:rPr>
         <w:lastRenderedPageBreak/>
-        <w:t xml:space="preserve">to capture seasonal patterns. The models were trained using a chronological split, with the last 24 months reserved for testing. Performance was evaluated using MAE, RMSE, MAPE, and R². The models achieved R² scores of 0.31, 0.34, 0.29, and 0.78 for Random Forest, </w:t>
-      </w:r>
-      <w:proofErr w:type="spellStart"/>
-      <w:r>
-        <w:rPr>
-          <w:lang w:val="en-US"/>
-        </w:rPr>
-        <w:t>XGBoost</w:t>
-      </w:r>
-      <w:proofErr w:type="spellEnd"/>
-      <w:r>
-        <w:rPr>
-          <w:lang w:val="en-US"/>
-        </w:rPr>
-        <w:t xml:space="preserve">, </w:t>
-      </w:r>
-      <w:proofErr w:type="spellStart"/>
-      <w:r>
-        <w:rPr>
-          <w:lang w:val="en-US"/>
-        </w:rPr>
-        <w:t>LightGBM</w:t>
-      </w:r>
-      <w:proofErr w:type="spellEnd"/>
-      <w:r>
-        <w:rPr>
-          <w:lang w:val="en-US"/>
-        </w:rPr>
-        <w:t>, and LSTM, respectively. LSTM achieved the best performance and was selected as the final demand forecasting model.</w:t>
-      </w:r>
+        <w:t>performance and was selected as the final demand forecasting model.</w:t>
+      </w:r>
+    </w:p>
+    <w:p>
+      <w:pPr>
+        <w:pStyle w:val="selectable-text"/>
+        <w:jc w:val="both"/>
+      </w:pPr>
     </w:p>
     <w:p>
       <w:pPr>
@@ -1953,6 +1958,9 @@
             </m:e>
           </m:d>
           <m:r>
+            <m:rPr>
+              <m:sty m:val="p"/>
+            </m:rPr>
             <w:br/>
           </m:r>
         </m:oMath>
@@ -2053,15 +2061,7 @@
         </m:r>
       </m:oMath>
       <w:r>
-        <w:t>, 90%, 95%, and 99% prediction intervals were generated for both e</w:t>
-      </w:r>
-      <w:proofErr w:type="spellStart"/>
-      <w:r>
-        <w:t>lectricity</w:t>
-      </w:r>
-      <w:proofErr w:type="spellEnd"/>
-      <w:r>
-        <w:t xml:space="preserve"> demand and supply.</w:t>
+        <w:t>, 90%, 95%, and 99% prediction intervals were generated for both electricity demand and supply.</w:t>
       </w:r>
     </w:p>
     <w:p>
@@ -2340,31 +2340,21 @@
         <w:rPr>
           <w:lang w:val="en-US"/>
         </w:rPr>
-        <w:t>After demand–supply gap analysis, a Retrieval-Augmented Generation (RAG) module was integrated to convert forecasting results into energy planning recommendations. The predicted gap was classified into three risk levels: below 3000 MU (Low), 3000–4500 MU (Moderate), and above 4500 MU (High). The forecasting output was converted into a query and transformed into vector embeddings using an embedding model. Relevant energy policies, government reports, and planning documents were also embedded and stored in a FAISS vector database. For each forecast, FAISS retrieved the most relevant documents based on vector similarity. The retrieved information, together with the predicted demand, supply, gap, and risk level, was provided to an LLM to generate recommendations.</w:t>
-      </w:r>
-      <w:r>
-        <w:rPr>
-          <w:lang w:val="en-US"/>
-        </w:rPr>
-        <w:t xml:space="preserve"> </w:t>
-      </w:r>
-      <w:r>
-        <w:rPr>
-          <w:lang w:val="en-US"/>
-        </w:rPr>
-        <w:t>The</w:t>
-      </w:r>
-      <w:r>
-        <w:rPr>
-          <w:lang w:val="en-US"/>
-        </w:rPr>
-        <w:t xml:space="preserve"> </w:t>
-      </w:r>
-      <w:r>
-        <w:rPr>
-          <w:lang w:val="en-US"/>
-        </w:rPr>
-        <w:t>generated recommendations were grounded in the retrieved policy information and included actions such as increasing generation, purchasing additional power, reducing peak demand, and scheduling maintenance during low-demand periods. Thus, the RAG module connects the ML forecasts with policy-based recommendations for practical energy planning.</w:t>
+        <w:t xml:space="preserve">After demand–supply gap analysis, a Retrieval-Augmented Generation (RAG) module was integrated to convert forecasting results into energy planning recommendations. The predicted gap was classified into three risk levels: below 3000 MU (Low), 3000–4500 MU (Moderate), and above 4500 MU (High). The RAG knowledge base comprised nine official energy-sector documents, including three Tamil Nadu and six national-level sources, containing 1,725 pages processed into 1,155 chunks. The forecasting output was converted into dynamic queries and transformed into 384-dimensional L2-normalized embeddings using all-MiniLM-L6-v2. The embedded documents were indexed using FAISS </w:t>
+      </w:r>
+      <w:proofErr w:type="spellStart"/>
+      <w:r>
+        <w:rPr>
+          <w:lang w:val="en-US"/>
+        </w:rPr>
+        <w:t>IndexFlatIP</w:t>
+      </w:r>
+      <w:proofErr w:type="spellEnd"/>
+      <w:r>
+        <w:rPr>
+          <w:lang w:val="en-US"/>
+        </w:rPr>
+        <w:t>, with cosine similarity used to retrieve the top-five relevant chunks. The retrieved context, together with the predicted demand, supply, gap, and risk level, was provided to the Gemini LLM to generate grounded recommendations with source and page references. Thus, the RAG module connects ML-based forecasts with evidence-based policy recommendations for practical energy planning.</w:t>
       </w:r>
       <w:r>
         <w:tab/>
@@ -2374,9 +2364,6 @@
       <w:pPr>
         <w:pStyle w:val="selectable-text"/>
         <w:jc w:val="center"/>
-        <w:rPr>
-          <w:lang w:val="en-US"/>
-        </w:rPr>
       </w:pPr>
       <w:r>
         <w:t xml:space="preserve">IV. </w:t>
@@ -2505,14 +2492,7 @@
         <w:rPr>
           <w:lang w:val="en-US"/>
         </w:rPr>
-        <w:t xml:space="preserve">. The dataset was divided into 80% training and 20% testing sets using a time-based split to preserve </w:t>
-      </w:r>
-      <w:r>
-        <w:rPr>
-          <w:lang w:val="en-US"/>
-        </w:rPr>
-        <w:lastRenderedPageBreak/>
-        <w:t>chronological order. Model performance was evaluated using MAE, RMSE, MAPE, and R². The best-performing models were then used to generate prediction intervals, demand–supply gap estimates, and RAG-based energy planning recommendations</w:t>
+        <w:t>. The dataset was divided into 80% training and 20% testing sets using a time-based split to preserve chronological order. Model performance was evaluated using MAE, RMSE, MAPE, and R². The best-performing models were then used to generate prediction intervals, demand–supply gap estimates, and RAG-based energy planning recommendations</w:t>
       </w:r>
       <w:r>
         <w:rPr>
@@ -2520,6 +2500,24 @@
         </w:rPr>
         <w:t>.</w:t>
       </w:r>
+    </w:p>
+    <w:p>
+      <w:pPr>
+        <w:pStyle w:val="selectable-text"/>
+        <w:jc w:val="both"/>
+        <w:rPr>
+          <w:lang w:val="en-US"/>
+        </w:rPr>
+      </w:pPr>
+    </w:p>
+    <w:p>
+      <w:pPr>
+        <w:pStyle w:val="selectable-text"/>
+        <w:jc w:val="both"/>
+        <w:rPr>
+          <w:lang w:val="en-US"/>
+        </w:rPr>
+      </w:pPr>
     </w:p>
     <w:p>
       <w:pPr>
@@ -3139,28 +3137,11 @@
     <w:p>
       <w:pPr>
         <w:pStyle w:val="selectable-text"/>
-        <w:jc w:val="both"/>
-      </w:pPr>
-      <w:r>
-        <w:tab/>
-      </w:r>
+      </w:pPr>
     </w:p>
     <w:p>
       <w:pPr>
         <w:pStyle w:val="selectable-text"/>
-        <w:jc w:val="both"/>
-      </w:pPr>
-    </w:p>
-    <w:p>
-      <w:pPr>
-        <w:pStyle w:val="selectable-text"/>
-        <w:jc w:val="both"/>
-      </w:pPr>
-    </w:p>
-    <w:p>
-      <w:pPr>
-        <w:pStyle w:val="selectable-text"/>
-        <w:jc w:val="both"/>
       </w:pPr>
       <w:r>
         <w:t>4.3 Electricity Supply Forecasting Results</w:t>
@@ -4076,19 +4057,316 @@
       <w:pPr>
         <w:pStyle w:val="selectable-text"/>
         <w:jc w:val="both"/>
-      </w:pPr>
-      <w:r>
-        <w:rPr>
-          <w:lang w:val="en-US"/>
-        </w:rPr>
-        <w:t xml:space="preserve">The demand–supply gap was calculated using the predicted electricity demand and supply values. A positive gap indicates a potential shortage, while a </w:t>
-      </w:r>
-      <w:r>
-        <w:rPr>
-          <w:lang w:val="en-US"/>
-        </w:rPr>
+        <w:rPr>
+          <w:lang w:val="en-US"/>
+        </w:rPr>
+      </w:pPr>
+      <w:r>
+        <w:rPr>
+          <w:lang w:val="en-US"/>
+        </w:rPr>
+        <w:t>The demand–supply gap was calculated from the predicted electricity demand and supply. The forecasted gaps for January, February, and March 2026 were 2237.88 MU, 3078.30 MU, and 3020.25 MU, respectively, indicating potential shortages. The 95% prediction intervals represent the uncertainty associated with the forecasted gaps.</w:t>
+      </w:r>
+    </w:p>
+    <w:p>
+      <w:pPr>
+        <w:pStyle w:val="selectable-text"/>
+        <w:jc w:val="both"/>
+      </w:pPr>
+    </w:p>
+    <w:p>
+      <w:pPr>
+        <w:pStyle w:val="selectable-text"/>
+        <w:jc w:val="both"/>
+      </w:pPr>
+      <w:r>
         <w:lastRenderedPageBreak/>
-        <w:t>negative gap indicates surplus generation. As shown in Table X, the predicted gaps for January, February, and March 2026 were 2237.88 MU, 3078.30 MU, and 3020.25 MU, respectively. All three months indicate a potential shortage. The 95% prediction intervals provide the uncertainty range associated with each forecasted gap.</w:t>
+        <w:t>4.4 RAG Evaluation Metrics Results</w:t>
+      </w:r>
+    </w:p>
+    <w:tbl>
+      <w:tblPr>
+        <w:tblW w:w="5220" w:type="dxa"/>
+        <w:tblInd w:w="-5" w:type="dxa"/>
+        <w:tblBorders>
+          <w:top w:val="single" w:sz="4" w:space="0" w:color="auto"/>
+          <w:left w:val="single" w:sz="4" w:space="0" w:color="auto"/>
+          <w:bottom w:val="single" w:sz="4" w:space="0" w:color="auto"/>
+          <w:right w:val="single" w:sz="4" w:space="0" w:color="auto"/>
+          <w:insideH w:val="single" w:sz="4" w:space="0" w:color="auto"/>
+          <w:insideV w:val="single" w:sz="4" w:space="0" w:color="auto"/>
+        </w:tblBorders>
+        <w:tblLook w:val="04A0" w:firstRow="1" w:lastRow="0" w:firstColumn="1" w:lastColumn="0" w:noHBand="0" w:noVBand="1"/>
+      </w:tblPr>
+      <w:tblGrid>
+        <w:gridCol w:w="1110"/>
+        <w:gridCol w:w="1110"/>
+        <w:gridCol w:w="976"/>
+        <w:gridCol w:w="840"/>
+        <w:gridCol w:w="1184"/>
+      </w:tblGrid>
+      <w:tr>
+        <w:trPr>
+          <w:trHeight w:val="989"/>
+        </w:trPr>
+        <w:tc>
+          <w:tcPr>
+            <w:tcW w:w="1110" w:type="dxa"/>
+          </w:tcPr>
+          <w:p>
+            <w:pPr>
+              <w:jc w:val="both"/>
+              <w:rPr>
+                <w:sz w:val="24"/>
+                <w:szCs w:val="24"/>
+                <w:lang w:val="en-IN" w:eastAsia="en-IN"/>
+              </w:rPr>
+            </w:pPr>
+            <w:r>
+              <w:rPr>
+                <w:sz w:val="24"/>
+                <w:szCs w:val="24"/>
+              </w:rPr>
+              <w:t>RAG System</w:t>
+            </w:r>
+          </w:p>
+          <w:p>
+            <w:pPr>
+              <w:pStyle w:val="selectable-text"/>
+              <w:jc w:val="both"/>
+            </w:pPr>
+          </w:p>
+        </w:tc>
+        <w:tc>
+          <w:tcPr>
+            <w:tcW w:w="1110" w:type="dxa"/>
+          </w:tcPr>
+          <w:p>
+            <w:pPr>
+              <w:pStyle w:val="selectable-text"/>
+              <w:jc w:val="both"/>
+            </w:pPr>
+            <w:r>
+              <w:rPr>
+                <w:lang w:val="en-US"/>
+              </w:rPr>
+              <w:t>Context Precision (%)</w:t>
+            </w:r>
+          </w:p>
+        </w:tc>
+        <w:tc>
+          <w:tcPr>
+            <w:tcW w:w="976" w:type="dxa"/>
+          </w:tcPr>
+          <w:p>
+            <w:pPr>
+              <w:pStyle w:val="selectable-text"/>
+              <w:jc w:val="both"/>
+            </w:pPr>
+            <w:r>
+              <w:rPr>
+                <w:lang w:val="en-US"/>
+              </w:rPr>
+              <w:t>Context Recall (%)</w:t>
+            </w:r>
+          </w:p>
+        </w:tc>
+        <w:tc>
+          <w:tcPr>
+            <w:tcW w:w="840" w:type="dxa"/>
+          </w:tcPr>
+          <w:tbl>
+            <w:tblPr>
+              <w:tblW w:w="561" w:type="dxa"/>
+              <w:tblCellSpacing w:w="15" w:type="dxa"/>
+              <w:tblCellMar>
+                <w:top w:w="15" w:type="dxa"/>
+                <w:left w:w="15" w:type="dxa"/>
+                <w:bottom w:w="15" w:type="dxa"/>
+                <w:right w:w="15" w:type="dxa"/>
+              </w:tblCellMar>
+              <w:tblLook w:val="04A0" w:firstRow="1" w:lastRow="0" w:firstColumn="1" w:lastColumn="0" w:noHBand="0" w:noVBand="1"/>
+            </w:tblPr>
+            <w:tblGrid>
+              <w:gridCol w:w="624"/>
+            </w:tblGrid>
+            <w:tr>
+              <w:trPr>
+                <w:trHeight w:val="571"/>
+                <w:tblCellSpacing w:w="15" w:type="dxa"/>
+              </w:trPr>
+              <w:tc>
+                <w:tcPr>
+                  <w:tcW w:w="0" w:type="auto"/>
+                  <w:vAlign w:val="center"/>
+                  <w:hideMark/>
+                </w:tcPr>
+                <w:p>
+                  <w:pPr>
+                    <w:pStyle w:val="selectable-text"/>
+                    <w:jc w:val="both"/>
+                  </w:pPr>
+                  <w:r>
+                    <w:t>MRR</w:t>
+                  </w:r>
+                </w:p>
+              </w:tc>
+            </w:tr>
+          </w:tbl>
+          <w:p>
+            <w:pPr>
+              <w:pStyle w:val="selectable-text"/>
+              <w:jc w:val="both"/>
+              <w:rPr>
+                <w:vanish/>
+              </w:rPr>
+            </w:pPr>
+          </w:p>
+          <w:tbl>
+            <w:tblPr>
+              <w:tblW w:w="86" w:type="dxa"/>
+              <w:tblCellSpacing w:w="15" w:type="dxa"/>
+              <w:tblCellMar>
+                <w:top w:w="15" w:type="dxa"/>
+                <w:left w:w="15" w:type="dxa"/>
+                <w:bottom w:w="15" w:type="dxa"/>
+                <w:right w:w="15" w:type="dxa"/>
+              </w:tblCellMar>
+              <w:tblLook w:val="04A0" w:firstRow="1" w:lastRow="0" w:firstColumn="1" w:lastColumn="0" w:noHBand="0" w:noVBand="1"/>
+            </w:tblPr>
+            <w:tblGrid>
+              <w:gridCol w:w="96"/>
+            </w:tblGrid>
+            <w:tr>
+              <w:trPr>
+                <w:tblCellSpacing w:w="15" w:type="dxa"/>
+              </w:trPr>
+              <w:tc>
+                <w:tcPr>
+                  <w:tcW w:w="0" w:type="auto"/>
+                  <w:vAlign w:val="center"/>
+                  <w:hideMark/>
+                </w:tcPr>
+                <w:p>
+                  <w:pPr>
+                    <w:pStyle w:val="selectable-text"/>
+                    <w:jc w:val="both"/>
+                  </w:pPr>
+                </w:p>
+              </w:tc>
+            </w:tr>
+          </w:tbl>
+          <w:p>
+            <w:pPr>
+              <w:pStyle w:val="selectable-text"/>
+              <w:jc w:val="both"/>
+            </w:pPr>
+          </w:p>
+        </w:tc>
+        <w:tc>
+          <w:tcPr>
+            <w:tcW w:w="1184" w:type="dxa"/>
+          </w:tcPr>
+          <w:p>
+            <w:pPr>
+              <w:pStyle w:val="selectable-text"/>
+              <w:jc w:val="both"/>
+            </w:pPr>
+            <w:r>
+              <w:rPr>
+                <w:lang w:val="en-US"/>
+              </w:rPr>
+              <w:t>nDCG@5</w:t>
+            </w:r>
+          </w:p>
+        </w:tc>
+      </w:tr>
+      <w:tr>
+        <w:trPr>
+          <w:trHeight w:val="614"/>
+        </w:trPr>
+        <w:tc>
+          <w:tcPr>
+            <w:tcW w:w="1110" w:type="dxa"/>
+          </w:tcPr>
+          <w:p>
+            <w:pPr>
+              <w:pStyle w:val="selectable-text"/>
+              <w:jc w:val="both"/>
+            </w:pPr>
+            <w:r>
+              <w:rPr>
+                <w:lang w:val="en-US"/>
+              </w:rPr>
+              <w:t>Proposed RAG</w:t>
+            </w:r>
+          </w:p>
+        </w:tc>
+        <w:tc>
+          <w:tcPr>
+            <w:tcW w:w="1110" w:type="dxa"/>
+          </w:tcPr>
+          <w:p>
+            <w:pPr>
+              <w:pStyle w:val="selectable-text"/>
+              <w:jc w:val="both"/>
+            </w:pPr>
+            <w:r>
+              <w:t>56.00</w:t>
+            </w:r>
+          </w:p>
+        </w:tc>
+        <w:tc>
+          <w:tcPr>
+            <w:tcW w:w="976" w:type="dxa"/>
+          </w:tcPr>
+          <w:p>
+            <w:pPr>
+              <w:pStyle w:val="selectable-text"/>
+              <w:jc w:val="both"/>
+            </w:pPr>
+            <w:r>
+              <w:t>66.25</w:t>
+            </w:r>
+          </w:p>
+        </w:tc>
+        <w:tc>
+          <w:tcPr>
+            <w:tcW w:w="840" w:type="dxa"/>
+          </w:tcPr>
+          <w:p>
+            <w:pPr>
+              <w:pStyle w:val="selectable-text"/>
+              <w:jc w:val="both"/>
+            </w:pPr>
+            <w:r>
+              <w:t>0.66</w:t>
+            </w:r>
+          </w:p>
+        </w:tc>
+        <w:tc>
+          <w:tcPr>
+            <w:tcW w:w="1184" w:type="dxa"/>
+          </w:tcPr>
+          <w:p>
+            <w:pPr>
+              <w:pStyle w:val="selectable-text"/>
+              <w:jc w:val="both"/>
+            </w:pPr>
+            <w:r>
+              <w:t>0.7216</w:t>
+            </w:r>
+          </w:p>
+        </w:tc>
+      </w:tr>
+    </w:tbl>
+    <w:p>
+      <w:pPr>
+        <w:pStyle w:val="selectable-text"/>
+        <w:jc w:val="both"/>
+      </w:pPr>
+      <w:r>
+        <w:t>The proposed RAG system achieved 56.00% Context Precision and 66.25% Context Recall, indicating effective retrieval of relevant information. The MRR of 0.66 and nDCG@5 of 0.7216 demonstrate that relevant information was generally ranked within the top retrieved contexts. Overall, the results demonstrate effective retrieval and ranking of domain-specific energy information.</w:t>
       </w:r>
     </w:p>
     <w:p>
@@ -4110,35 +4388,7 @@
         <w:rPr>
           <w:lang w:val="en-US"/>
         </w:rPr>
-        <w:t xml:space="preserve">This study developed a machine learning framework for forecasting electricity demand and supply in Tamil Nadu using historical electricity and weather data. Four models—Random Forest, </w:t>
-      </w:r>
-      <w:proofErr w:type="spellStart"/>
-      <w:r>
-        <w:rPr>
-          <w:lang w:val="en-US"/>
-        </w:rPr>
-        <w:t>XGBoost</w:t>
-      </w:r>
-      <w:proofErr w:type="spellEnd"/>
-      <w:r>
-        <w:rPr>
-          <w:lang w:val="en-US"/>
-        </w:rPr>
-        <w:t xml:space="preserve">, </w:t>
-      </w:r>
-      <w:proofErr w:type="spellStart"/>
-      <w:r>
-        <w:rPr>
-          <w:lang w:val="en-US"/>
-        </w:rPr>
-        <w:t>LightGBM</w:t>
-      </w:r>
-      <w:proofErr w:type="spellEnd"/>
-      <w:r>
-        <w:rPr>
-          <w:lang w:val="en-US"/>
-        </w:rPr>
-        <w:t>, and LSTM—were evaluated, with LSTM providing the best forecasting performance. Prediction intervals at 90%, 95%, and 99% levels were used to quantify forecast uncertainty, while demand–supply gap analysis identified potential shortages and surpluses. A RAG-based framework was further integrated to generate energy planning recommendations using relevant knowledge sources. The proposed framework provides a unified approach for forecasting, risk assessment, and energy planning. Future work will focus on real-time data, additional weather features, and advanced deep learning models such as Transformers.</w:t>
+        <w:t>This study presents a unified framework for electricity demand and supply forecasting, uncertainty analysis, gap assessment, and RAG-based energy planning recommendations for Tamil Nadu. Among the evaluated models, LSTM achieved the best forecasting performance. The integrated RAG framework further supports evidence-based energy planning. Future work will explore real-time data, additional weather features, and Transformer-based models.</w:t>
       </w:r>
       <w:r>
         <w:tab/>
@@ -4487,7 +4737,14 @@
           <w:sz w:val="16"/>
           <w:szCs w:val="16"/>
         </w:rPr>
-        <w:t>"Time and Day-Based Peak Electricity Demand Forecasting: A Comparative Analysis of Machine Learning Models for Peak Cut and Decarbonization,"</w:t>
+        <w:t xml:space="preserve">"Time and Day-Based Peak Electricity Demand Forecasting: A Comparative Analysis of Machine </w:t>
+      </w:r>
+      <w:r>
+        <w:rPr>
+          <w:sz w:val="16"/>
+          <w:szCs w:val="16"/>
+        </w:rPr>
+        <w:t>Learning Models for Peak Cut and Decarbonization,"</w:t>
       </w:r>
       <w:r>
         <w:rPr>
@@ -5725,7 +5982,15 @@
           <w:sz w:val="16"/>
           <w:szCs w:val="16"/>
         </w:rPr>
-        <w:t>"Distributed Photovoltaic Power Forecasting Based on Auto Machine Learning Framework and Fusion Perception Technology,"</w:t>
+        <w:t xml:space="preserve">"Distributed Photovoltaic Power Forecasting Based on Auto </w:t>
+      </w:r>
+      <w:r>
+        <w:rPr>
+          <w:sz w:val="16"/>
+          <w:szCs w:val="16"/>
+        </w:rPr>
+        <w:lastRenderedPageBreak/>
+        <w:t>Machine Learning Framework and Fusion Perception Technology,"</w:t>
       </w:r>
       <w:r>
         <w:rPr>
@@ -5756,7 +6021,6 @@
           <w:sz w:val="16"/>
           <w:szCs w:val="16"/>
         </w:rPr>
-        <w:lastRenderedPageBreak/>
         <w:t xml:space="preserve">[23] Rui Zhang, </w:t>
       </w:r>
       <w:proofErr w:type="spellStart"/>
@@ -7195,6 +7459,7 @@
         <w:strike w:val="0"/>
         <w:dstrike w:val="0"/>
         <w:vanish w:val="0"/>
+        <w:color w:val="000000"/>
         <w:sz w:val="16"/>
         <w:szCs w:val="16"/>
         <w:vertAlign w:val="superscript"/>
@@ -7206,11 +7471,6 @@
           <w14:prstDash w14:val="solid"/>
           <w14:bevel/>
         </w14:textOutline>
-        <w14:textFill>
-          <w14:solidFill>
-            <w14:srgbClr w14:val="000000"/>
-          </w14:solidFill>
-        </w14:textFill>
       </w:rPr>
     </w:lvl>
     <w:lvl w:ilvl="1" w:tplc="04090019">
@@ -7814,6 +8074,92 @@
     </w:lvl>
   </w:abstractNum>
   <w:abstractNum w:abstractNumId="18" w15:restartNumberingAfterBreak="0">
+    <w:nsid w:val="4ED16571"/>
+    <w:multiLevelType w:val="hybridMultilevel"/>
+    <w:tmpl w:val="F66421FE"/>
+    <w:lvl w:ilvl="0" w:tplc="40090013">
+      <w:start w:val="1"/>
+      <w:numFmt w:val="upperRoman"/>
+      <w:lvlText w:val="%1."/>
+      <w:lvlJc w:val="right"/>
+      <w:pPr>
+        <w:ind w:left="720" w:hanging="360"/>
+      </w:pPr>
+    </w:lvl>
+    <w:lvl w:ilvl="1" w:tplc="40090019" w:tentative="1">
+      <w:start w:val="1"/>
+      <w:numFmt w:val="lowerLetter"/>
+      <w:lvlText w:val="%2."/>
+      <w:lvlJc w:val="left"/>
+      <w:pPr>
+        <w:ind w:left="1440" w:hanging="360"/>
+      </w:pPr>
+    </w:lvl>
+    <w:lvl w:ilvl="2" w:tplc="4009001B" w:tentative="1">
+      <w:start w:val="1"/>
+      <w:numFmt w:val="lowerRoman"/>
+      <w:lvlText w:val="%3."/>
+      <w:lvlJc w:val="right"/>
+      <w:pPr>
+        <w:ind w:left="2160" w:hanging="180"/>
+      </w:pPr>
+    </w:lvl>
+    <w:lvl w:ilvl="3" w:tplc="4009000F" w:tentative="1">
+      <w:start w:val="1"/>
+      <w:numFmt w:val="decimal"/>
+      <w:lvlText w:val="%4."/>
+      <w:lvlJc w:val="left"/>
+      <w:pPr>
+        <w:ind w:left="2880" w:hanging="360"/>
+      </w:pPr>
+    </w:lvl>
+    <w:lvl w:ilvl="4" w:tplc="40090019" w:tentative="1">
+      <w:start w:val="1"/>
+      <w:numFmt w:val="lowerLetter"/>
+      <w:lvlText w:val="%5."/>
+      <w:lvlJc w:val="left"/>
+      <w:pPr>
+        <w:ind w:left="3600" w:hanging="360"/>
+      </w:pPr>
+    </w:lvl>
+    <w:lvl w:ilvl="5" w:tplc="4009001B" w:tentative="1">
+      <w:start w:val="1"/>
+      <w:numFmt w:val="lowerRoman"/>
+      <w:lvlText w:val="%6."/>
+      <w:lvlJc w:val="right"/>
+      <w:pPr>
+        <w:ind w:left="4320" w:hanging="180"/>
+      </w:pPr>
+    </w:lvl>
+    <w:lvl w:ilvl="6" w:tplc="4009000F" w:tentative="1">
+      <w:start w:val="1"/>
+      <w:numFmt w:val="decimal"/>
+      <w:lvlText w:val="%7."/>
+      <w:lvlJc w:val="left"/>
+      <w:pPr>
+        <w:ind w:left="5040" w:hanging="360"/>
+      </w:pPr>
+    </w:lvl>
+    <w:lvl w:ilvl="7" w:tplc="40090019" w:tentative="1">
+      <w:start w:val="1"/>
+      <w:numFmt w:val="lowerLetter"/>
+      <w:lvlText w:val="%8."/>
+      <w:lvlJc w:val="left"/>
+      <w:pPr>
+        <w:ind w:left="5760" w:hanging="360"/>
+      </w:pPr>
+    </w:lvl>
+    <w:lvl w:ilvl="8" w:tplc="4009001B" w:tentative="1">
+      <w:start w:val="1"/>
+      <w:numFmt w:val="lowerRoman"/>
+      <w:lvlText w:val="%9."/>
+      <w:lvlJc w:val="right"/>
+      <w:pPr>
+        <w:ind w:left="6480" w:hanging="180"/>
+      </w:pPr>
+    </w:lvl>
+  </w:abstractNum>
+  <w:abstractNum w:abstractNumId="19" w15:restartNumberingAfterBreak="0">
     <w:nsid w:val="52CA544A"/>
     <w:multiLevelType w:val="singleLevel"/>
     <w:tmpl w:val="AED6D67E"/>
@@ -7840,7 +8186,7 @@
       </w:rPr>
     </w:lvl>
   </w:abstractNum>
-  <w:abstractNum w:abstractNumId="19" w15:restartNumberingAfterBreak="0">
+  <w:abstractNum w:abstractNumId="20" w15:restartNumberingAfterBreak="0">
     <w:nsid w:val="6C402C58"/>
     <w:multiLevelType w:val="hybridMultilevel"/>
     <w:tmpl w:val="9A1CA078"/>
@@ -7985,7 +8331,7 @@
       </w:rPr>
     </w:lvl>
   </w:abstractNum>
-  <w:abstractNum w:abstractNumId="20" w15:restartNumberingAfterBreak="0">
+  <w:abstractNum w:abstractNumId="21" w15:restartNumberingAfterBreak="0">
     <w:nsid w:val="6CD32DA8"/>
     <w:multiLevelType w:val="singleLevel"/>
     <w:tmpl w:val="166470C2"/>
@@ -8015,7 +8361,7 @@
     <w:abstractNumId w:val="14"/>
   </w:num>
   <w:num w:numId="2" w16cid:durableId="1012877353">
-    <w:abstractNumId w:val="19"/>
+    <w:abstractNumId w:val="20"/>
   </w:num>
   <w:num w:numId="3" w16cid:durableId="238057288">
     <w:abstractNumId w:val="13"/>
@@ -8033,10 +8379,10 @@
     <w:abstractNumId w:val="16"/>
   </w:num>
   <w:num w:numId="8" w16cid:durableId="1393699313">
-    <w:abstractNumId w:val="18"/>
+    <w:abstractNumId w:val="19"/>
   </w:num>
   <w:num w:numId="9" w16cid:durableId="771440764">
-    <w:abstractNumId w:val="20"/>
+    <w:abstractNumId w:val="21"/>
   </w:num>
   <w:num w:numId="10" w16cid:durableId="385496382">
     <w:abstractNumId w:val="15"/>
@@ -8115,18 +8461,9 @@
   </w:num>
   <w:num w:numId="26" w16cid:durableId="1179076856">
     <w:abstractNumId w:val="14"/>
-    <w:lvlOverride w:ilvl="0"/>
-    <w:lvlOverride w:ilvl="1"/>
-    <w:lvlOverride w:ilvl="2"/>
-    <w:lvlOverride w:ilvl="3"/>
-    <w:lvlOverride w:ilvl="4"/>
-    <w:lvlOverride w:ilvl="5"/>
-    <w:lvlOverride w:ilvl="6"/>
-    <w:lvlOverride w:ilvl="7"/>
-    <w:lvlOverride w:ilvl="8"/>
   </w:num>
   <w:num w:numId="27" w16cid:durableId="128473093">
-    <w:abstractNumId w:val="19"/>
+    <w:abstractNumId w:val="20"/>
     <w:lvlOverride w:ilvl="0">
       <w:startOverride w:val="1"/>
     </w:lvlOverride>
@@ -8156,10 +8493,13 @@
     </w:lvlOverride>
   </w:num>
   <w:num w:numId="28" w16cid:durableId="2072656717">
-    <w:abstractNumId w:val="18"/>
+    <w:abstractNumId w:val="19"/>
     <w:lvlOverride w:ilvl="0">
       <w:startOverride w:val="1"/>
     </w:lvlOverride>
+  </w:num>
+  <w:num w:numId="29" w16cid:durableId="1217161271">
+    <w:abstractNumId w:val="18"/>
   </w:num>
 </w:numbering>
 </file>
@@ -8192,6 +8532,50 @@
     <w:lsdException w:name="Strong" w:qFormat="1"/>
     <w:lsdException w:name="Emphasis" w:qFormat="1"/>
     <w:lsdException w:name="Normal (Web)" w:uiPriority="99"/>
+    <w:lsdException w:name="Normal Table" w:semiHidden="1" w:unhideWhenUsed="1"/>
+    <w:lsdException w:name="Table Simple 1" w:semiHidden="1" w:unhideWhenUsed="1"/>
+    <w:lsdException w:name="Table Simple 2" w:semiHidden="1" w:unhideWhenUsed="1"/>
+    <w:lsdException w:name="Table Simple 3" w:semiHidden="1" w:unhideWhenUsed="1"/>
+    <w:lsdException w:name="Table Classic 1" w:semiHidden="1" w:unhideWhenUsed="1"/>
+    <w:lsdException w:name="Table Classic 2" w:semiHidden="1" w:unhideWhenUsed="1"/>
+    <w:lsdException w:name="Table Classic 3" w:semiHidden="1" w:unhideWhenUsed="1"/>
+    <w:lsdException w:name="Table Classic 4" w:semiHidden="1" w:unhideWhenUsed="1"/>
+    <w:lsdException w:name="Table Colorful 1" w:semiHidden="1" w:unhideWhenUsed="1"/>
+    <w:lsdException w:name="Table Colorful 2" w:semiHidden="1" w:unhideWhenUsed="1"/>
+    <w:lsdException w:name="Table Colorful 3" w:semiHidden="1" w:unhideWhenUsed="1"/>
+    <w:lsdException w:name="Table Columns 1" w:semiHidden="1" w:unhideWhenUsed="1"/>
+    <w:lsdException w:name="Table Columns 2" w:semiHidden="1" w:unhideWhenUsed="1"/>
+    <w:lsdException w:name="Table Columns 3" w:semiHidden="1" w:unhideWhenUsed="1"/>
+    <w:lsdException w:name="Table Columns 4" w:semiHidden="1" w:unhideWhenUsed="1"/>
+    <w:lsdException w:name="Table Columns 5" w:semiHidden="1" w:unhideWhenUsed="1"/>
+    <w:lsdException w:name="Table Grid 1" w:semiHidden="1" w:unhideWhenUsed="1"/>
+    <w:lsdException w:name="Table Grid 2" w:semiHidden="1" w:unhideWhenUsed="1"/>
+    <w:lsdException w:name="Table Grid 3" w:semiHidden="1" w:unhideWhenUsed="1"/>
+    <w:lsdException w:name="Table Grid 4" w:semiHidden="1" w:unhideWhenUsed="1"/>
+    <w:lsdException w:name="Table Grid 5" w:semiHidden="1" w:unhideWhenUsed="1"/>
+    <w:lsdException w:name="Table Grid 6" w:semiHidden="1" w:unhideWhenUsed="1"/>
+    <w:lsdException w:name="Table Grid 7" w:semiHidden="1" w:unhideWhenUsed="1"/>
+    <w:lsdException w:name="Table Grid 8" w:semiHidden="1" w:unhideWhenUsed="1"/>
+    <w:lsdException w:name="Table List 1" w:semiHidden="1" w:unhideWhenUsed="1"/>
+    <w:lsdException w:name="Table List 2" w:semiHidden="1" w:unhideWhenUsed="1"/>
+    <w:lsdException w:name="Table List 3" w:semiHidden="1" w:unhideWhenUsed="1"/>
+    <w:lsdException w:name="Table List 4" w:semiHidden="1" w:unhideWhenUsed="1"/>
+    <w:lsdException w:name="Table List 5" w:semiHidden="1" w:unhideWhenUsed="1"/>
+    <w:lsdException w:name="Table List 6" w:semiHidden="1" w:unhideWhenUsed="1"/>
+    <w:lsdException w:name="Table List 7" w:semiHidden="1" w:unhideWhenUsed="1"/>
+    <w:lsdException w:name="Table List 8" w:semiHidden="1" w:unhideWhenUsed="1"/>
+    <w:lsdException w:name="Table 3D effects 1" w:semiHidden="1" w:unhideWhenUsed="1"/>
+    <w:lsdException w:name="Table 3D effects 2" w:semiHidden="1" w:unhideWhenUsed="1"/>
+    <w:lsdException w:name="Table 3D effects 3" w:semiHidden="1" w:unhideWhenUsed="1"/>
+    <w:lsdException w:name="Table Contemporary" w:semiHidden="1" w:unhideWhenUsed="1"/>
+    <w:lsdException w:name="Table Elegant" w:semiHidden="1" w:unhideWhenUsed="1"/>
+    <w:lsdException w:name="Table Professional" w:semiHidden="1" w:unhideWhenUsed="1"/>
+    <w:lsdException w:name="Table Subtle 1" w:semiHidden="1" w:unhideWhenUsed="1"/>
+    <w:lsdException w:name="Table Subtle 2" w:semiHidden="1" w:unhideWhenUsed="1"/>
+    <w:lsdException w:name="Table Web 1" w:semiHidden="1" w:unhideWhenUsed="1"/>
+    <w:lsdException w:name="Table Web 2" w:semiHidden="1" w:unhideWhenUsed="1"/>
+    <w:lsdException w:name="Table Web 3" w:semiHidden="1" w:unhideWhenUsed="1"/>
+    <w:lsdException w:name="Table Theme" w:semiHidden="1" w:unhideWhenUsed="1"/>
     <w:lsdException w:name="Placeholder Text" w:semiHidden="1" w:uiPriority="99"/>
     <w:lsdException w:name="No Spacing" w:uiPriority="1" w:qFormat="1"/>
     <w:lsdException w:name="Light Shading" w:uiPriority="60"/>
@@ -8416,7 +8800,7 @@
   <w:style w:type="paragraph" w:default="1" w:styleId="Normal">
     <w:name w:val="Normal"/>
     <w:qFormat/>
-    <w:rsid w:val="0078566A"/>
+    <w:rsid w:val="00E517E4"/>
     <w:pPr>
       <w:jc w:val="center"/>
     </w:pPr>
@@ -8542,10 +8926,15 @@
   </w:style>
   <w:style w:type="character" w:default="1" w:styleId="DefaultParagraphFont">
     <w:name w:val="Default Paragraph Font"/>
+    <w:uiPriority w:val="1"/>
+    <w:semiHidden/>
+    <w:unhideWhenUsed/>
   </w:style>
   <w:style w:type="table" w:default="1" w:styleId="TableNormal">
     <w:name w:val="Normal Table"/>
+    <w:uiPriority w:val="99"/>
     <w:semiHidden/>
+    <w:unhideWhenUsed/>
     <w:tblPr>
       <w:tblInd w:w="0" w:type="dxa"/>
       <w:tblCellMar>
@@ -8558,7 +8947,9 @@
   </w:style>
   <w:style w:type="numbering" w:default="1" w:styleId="NoList">
     <w:name w:val="No List"/>
+    <w:uiPriority w:val="99"/>
     <w:semiHidden/>
+    <w:unhideWhenUsed/>
   </w:style>
   <w:style w:type="paragraph" w:customStyle="1" w:styleId="Abstract">
     <w:name w:val="Abstract"/>

</xml_diff>